<commit_message>
Auto sync from Mac: 2026年 4月19日 星期日 11时40分05秒 CST
</commit_message>
<xml_diff>
--- a/26MathorCup/2026年第十六届MathorCup数学应用挑战赛赛题/D题/附件1.docx
+++ b/26MathorCup/2026年第十六届MathorCup数学应用挑战赛赛题/D题/附件1.docx
@@ -326,17 +326,7 @@
           <w:sz w:val="28"/>
           <w:szCs w:val="32"/>
         </w:rPr>
-        <w:t>（2）</w:t>
-      </w:r>
-      <w:bookmarkStart w:id="0" w:name="_GoBack"/>
-      <w:bookmarkEnd w:id="0"/>
-      <w:r>
-        <w:rPr>
-          <w:rFonts w:hint="eastAsia"/>
-          <w:sz w:val="28"/>
-          <w:szCs w:val="32"/>
-        </w:rPr>
-        <w:t xml:space="preserve">稳定性约束：货物高度不得超过车厢高度，且顶层货物距车厢顶部预留不小于 </w:t>
+        <w:t xml:space="preserve">（2）稳定性约束：货物高度不得超过车厢高度，且顶层货物距车厢顶部预留不小于 </w:t>
       </w:r>
       <w:r>
         <w:rPr>
@@ -422,22 +412,6 @@
         <w:gridCol w:w="1705"/>
       </w:tblGrid>
       <w:tr>
-        <w:tblPrEx>
-          <w:tblBorders>
-            <w:top w:val="single" w:color="auto" w:sz="4" w:space="0"/>
-            <w:left w:val="single" w:color="auto" w:sz="4" w:space="0"/>
-            <w:bottom w:val="single" w:color="auto" w:sz="4" w:space="0"/>
-            <w:right w:val="single" w:color="auto" w:sz="4" w:space="0"/>
-            <w:insideH w:val="single" w:color="auto" w:sz="4" w:space="0"/>
-            <w:insideV w:val="single" w:color="auto" w:sz="4" w:space="0"/>
-          </w:tblBorders>
-          <w:tblCellMar>
-            <w:top w:w="0" w:type="dxa"/>
-            <w:left w:w="108" w:type="dxa"/>
-            <w:bottom w:w="0" w:type="dxa"/>
-            <w:right w:w="108" w:type="dxa"/>
-          </w:tblCellMar>
-        </w:tblPrEx>
         <w:tc>
           <w:tcPr>
             <w:tcW w:w="1704" w:type="dxa"/>
@@ -565,22 +539,6 @@
         </w:tc>
       </w:tr>
       <w:tr>
-        <w:tblPrEx>
-          <w:tblBorders>
-            <w:top w:val="single" w:color="auto" w:sz="4" w:space="0"/>
-            <w:left w:val="single" w:color="auto" w:sz="4" w:space="0"/>
-            <w:bottom w:val="single" w:color="auto" w:sz="4" w:space="0"/>
-            <w:right w:val="single" w:color="auto" w:sz="4" w:space="0"/>
-            <w:insideH w:val="single" w:color="auto" w:sz="4" w:space="0"/>
-            <w:insideV w:val="single" w:color="auto" w:sz="4" w:space="0"/>
-          </w:tblBorders>
-          <w:tblCellMar>
-            <w:top w:w="0" w:type="dxa"/>
-            <w:left w:w="108" w:type="dxa"/>
-            <w:bottom w:w="0" w:type="dxa"/>
-            <w:right w:w="108" w:type="dxa"/>
-          </w:tblCellMar>
-        </w:tblPrEx>
         <w:tc>
           <w:tcPr>
             <w:tcW w:w="1704" w:type="dxa"/>
@@ -690,10 +648,11 @@
             <w:pPr>
               <w:jc w:val="center"/>
               <w:rPr>
-                <w:rFonts w:hint="eastAsia"/>
-                <w:sz w:val="24"/>
-                <w:szCs w:val="24"/>
-                <w:vertAlign w:val="baseline"/>
+                <w:rFonts w:hint="eastAsia" w:eastAsiaTheme="minorEastAsia"/>
+                <w:sz w:val="24"/>
+                <w:szCs w:val="24"/>
+                <w:vertAlign w:val="baseline"/>
+                <w:lang w:val="en-US" w:eastAsia="zh-CN"/>
               </w:rPr>
             </w:pPr>
             <w:r>
@@ -703,27 +662,20 @@
                 <w:szCs w:val="24"/>
               </w:rPr>
               <w:t>80</w:t>
+            </w:r>
+            <w:r>
+              <w:rPr>
+                <w:rFonts w:hint="eastAsia"/>
+                <w:sz w:val="24"/>
+                <w:szCs w:val="24"/>
+                <w:lang w:val="en-US" w:eastAsia="zh-CN"/>
+              </w:rPr>
+              <w:t>0</w:t>
             </w:r>
           </w:p>
         </w:tc>
       </w:tr>
       <w:tr>
-        <w:tblPrEx>
-          <w:tblBorders>
-            <w:top w:val="single" w:color="auto" w:sz="4" w:space="0"/>
-            <w:left w:val="single" w:color="auto" w:sz="4" w:space="0"/>
-            <w:bottom w:val="single" w:color="auto" w:sz="4" w:space="0"/>
-            <w:right w:val="single" w:color="auto" w:sz="4" w:space="0"/>
-            <w:insideH w:val="single" w:color="auto" w:sz="4" w:space="0"/>
-            <w:insideV w:val="single" w:color="auto" w:sz="4" w:space="0"/>
-          </w:tblBorders>
-          <w:tblCellMar>
-            <w:top w:w="0" w:type="dxa"/>
-            <w:left w:w="108" w:type="dxa"/>
-            <w:bottom w:w="0" w:type="dxa"/>
-            <w:right w:w="108" w:type="dxa"/>
-          </w:tblCellMar>
-        </w:tblPrEx>
         <w:tc>
           <w:tcPr>
             <w:tcW w:w="1704" w:type="dxa"/>
@@ -833,10 +785,11 @@
             <w:pPr>
               <w:jc w:val="center"/>
               <w:rPr>
-                <w:rFonts w:hint="eastAsia"/>
-                <w:sz w:val="24"/>
-                <w:szCs w:val="24"/>
-                <w:vertAlign w:val="baseline"/>
+                <w:rFonts w:hint="eastAsia" w:eastAsiaTheme="minorEastAsia"/>
+                <w:sz w:val="24"/>
+                <w:szCs w:val="24"/>
+                <w:vertAlign w:val="baseline"/>
+                <w:lang w:val="en-US" w:eastAsia="zh-CN"/>
               </w:rPr>
             </w:pPr>
             <w:r>
@@ -846,27 +799,20 @@
                 <w:szCs w:val="24"/>
               </w:rPr>
               <w:t>100</w:t>
+            </w:r>
+            <w:r>
+              <w:rPr>
+                <w:rFonts w:hint="eastAsia"/>
+                <w:sz w:val="24"/>
+                <w:szCs w:val="24"/>
+                <w:lang w:val="en-US" w:eastAsia="zh-CN"/>
+              </w:rPr>
+              <w:t>0</w:t>
             </w:r>
           </w:p>
         </w:tc>
       </w:tr>
       <w:tr>
-        <w:tblPrEx>
-          <w:tblBorders>
-            <w:top w:val="single" w:color="auto" w:sz="4" w:space="0"/>
-            <w:left w:val="single" w:color="auto" w:sz="4" w:space="0"/>
-            <w:bottom w:val="single" w:color="auto" w:sz="4" w:space="0"/>
-            <w:right w:val="single" w:color="auto" w:sz="4" w:space="0"/>
-            <w:insideH w:val="single" w:color="auto" w:sz="4" w:space="0"/>
-            <w:insideV w:val="single" w:color="auto" w:sz="4" w:space="0"/>
-          </w:tblBorders>
-          <w:tblCellMar>
-            <w:top w:w="0" w:type="dxa"/>
-            <w:left w:w="108" w:type="dxa"/>
-            <w:bottom w:w="0" w:type="dxa"/>
-            <w:right w:w="108" w:type="dxa"/>
-          </w:tblCellMar>
-        </w:tblPrEx>
         <w:tc>
           <w:tcPr>
             <w:tcW w:w="1704" w:type="dxa"/>
@@ -976,10 +922,11 @@
             <w:pPr>
               <w:jc w:val="center"/>
               <w:rPr>
-                <w:rFonts w:hint="eastAsia"/>
-                <w:sz w:val="24"/>
-                <w:szCs w:val="24"/>
-                <w:vertAlign w:val="baseline"/>
+                <w:rFonts w:hint="eastAsia" w:eastAsiaTheme="minorEastAsia"/>
+                <w:sz w:val="24"/>
+                <w:szCs w:val="24"/>
+                <w:vertAlign w:val="baseline"/>
+                <w:lang w:val="en-US" w:eastAsia="zh-CN"/>
               </w:rPr>
             </w:pPr>
             <w:r>
@@ -989,27 +936,20 @@
                 <w:szCs w:val="24"/>
               </w:rPr>
               <w:t>30</w:t>
+            </w:r>
+            <w:r>
+              <w:rPr>
+                <w:rFonts w:hint="eastAsia"/>
+                <w:sz w:val="24"/>
+                <w:szCs w:val="24"/>
+                <w:lang w:val="en-US" w:eastAsia="zh-CN"/>
+              </w:rPr>
+              <w:t>0</w:t>
             </w:r>
           </w:p>
         </w:tc>
       </w:tr>
       <w:tr>
-        <w:tblPrEx>
-          <w:tblBorders>
-            <w:top w:val="single" w:color="auto" w:sz="4" w:space="0"/>
-            <w:left w:val="single" w:color="auto" w:sz="4" w:space="0"/>
-            <w:bottom w:val="single" w:color="auto" w:sz="4" w:space="0"/>
-            <w:right w:val="single" w:color="auto" w:sz="4" w:space="0"/>
-            <w:insideH w:val="single" w:color="auto" w:sz="4" w:space="0"/>
-            <w:insideV w:val="single" w:color="auto" w:sz="4" w:space="0"/>
-          </w:tblBorders>
-          <w:tblCellMar>
-            <w:top w:w="0" w:type="dxa"/>
-            <w:left w:w="108" w:type="dxa"/>
-            <w:bottom w:w="0" w:type="dxa"/>
-            <w:right w:w="108" w:type="dxa"/>
-          </w:tblCellMar>
-        </w:tblPrEx>
         <w:tc>
           <w:tcPr>
             <w:tcW w:w="1704" w:type="dxa"/>
@@ -1119,10 +1059,11 @@
             <w:pPr>
               <w:jc w:val="center"/>
               <w:rPr>
-                <w:rFonts w:hint="eastAsia"/>
-                <w:sz w:val="24"/>
-                <w:szCs w:val="24"/>
-                <w:vertAlign w:val="baseline"/>
+                <w:rFonts w:hint="eastAsia" w:eastAsiaTheme="minorEastAsia"/>
+                <w:sz w:val="24"/>
+                <w:szCs w:val="24"/>
+                <w:vertAlign w:val="baseline"/>
+                <w:lang w:val="en-US" w:eastAsia="zh-CN"/>
               </w:rPr>
             </w:pPr>
             <w:r>
@@ -1132,27 +1073,20 @@
                 <w:szCs w:val="24"/>
               </w:rPr>
               <w:t>40</w:t>
+            </w:r>
+            <w:r>
+              <w:rPr>
+                <w:rFonts w:hint="eastAsia"/>
+                <w:sz w:val="24"/>
+                <w:szCs w:val="24"/>
+                <w:lang w:val="en-US" w:eastAsia="zh-CN"/>
+              </w:rPr>
+              <w:t>0</w:t>
             </w:r>
           </w:p>
         </w:tc>
       </w:tr>
       <w:tr>
-        <w:tblPrEx>
-          <w:tblBorders>
-            <w:top w:val="single" w:color="auto" w:sz="4" w:space="0"/>
-            <w:left w:val="single" w:color="auto" w:sz="4" w:space="0"/>
-            <w:bottom w:val="single" w:color="auto" w:sz="4" w:space="0"/>
-            <w:right w:val="single" w:color="auto" w:sz="4" w:space="0"/>
-            <w:insideH w:val="single" w:color="auto" w:sz="4" w:space="0"/>
-            <w:insideV w:val="single" w:color="auto" w:sz="4" w:space="0"/>
-          </w:tblBorders>
-          <w:tblCellMar>
-            <w:top w:w="0" w:type="dxa"/>
-            <w:left w:w="108" w:type="dxa"/>
-            <w:bottom w:w="0" w:type="dxa"/>
-            <w:right w:w="108" w:type="dxa"/>
-          </w:tblCellMar>
-        </w:tblPrEx>
         <w:tc>
           <w:tcPr>
             <w:tcW w:w="1704" w:type="dxa"/>
@@ -1274,7 +1208,26 @@
                 <w:sz w:val="24"/>
                 <w:szCs w:val="24"/>
               </w:rPr>
-              <w:t>50</w:t>
+              <w:t>5</w:t>
+            </w:r>
+            <w:r>
+              <w:rPr>
+                <w:rFonts w:hint="eastAsia"/>
+                <w:sz w:val="24"/>
+                <w:szCs w:val="24"/>
+                <w:lang w:val="en-US" w:eastAsia="zh-CN"/>
+              </w:rPr>
+              <w:t>0</w:t>
+            </w:r>
+            <w:bookmarkStart w:id="0" w:name="_GoBack"/>
+            <w:bookmarkEnd w:id="0"/>
+            <w:r>
+              <w:rPr>
+                <w:rFonts w:hint="eastAsia"/>
+                <w:sz w:val="24"/>
+                <w:szCs w:val="24"/>
+              </w:rPr>
+              <w:t>0</w:t>
             </w:r>
           </w:p>
         </w:tc>

</xml_diff>

<commit_message>
Auto sync from Mac: 2026年 4月21日 星期二 19时52分13秒 CST
</commit_message>
<xml_diff>
--- a/26MathorCup/2026年第十六届MathorCup数学应用挑战赛赛题/D题/附件1.docx
+++ b/26MathorCup/2026年第十六届MathorCup数学应用挑战赛赛题/D题/附件1.docx
@@ -1219,8 +1219,6 @@
               </w:rPr>
               <w:t>0</w:t>
             </w:r>
-            <w:bookmarkStart w:id="0" w:name="_GoBack"/>
-            <w:bookmarkEnd w:id="0"/>
             <w:r>
               <w:rPr>
                 <w:rFonts w:hint="eastAsia"/>
@@ -1233,7 +1231,10 @@
         </w:tc>
       </w:tr>
     </w:tbl>
-    <w:p/>
+    <w:p>
+      <w:bookmarkStart w:id="0" w:name="_GoBack"/>
+      <w:bookmarkEnd w:id="0"/>
+    </w:p>
     <w:sectPr>
       <w:pgSz w:w="11906" w:h="16838"/>
       <w:pgMar w:top="1440" w:right="1800" w:bottom="1440" w:left="1800" w:header="851" w:footer="992" w:gutter="0"/>

</xml_diff>